<commit_message>
Update NETWORK VIRTUALIZATION AND SECURITY.docx
</commit_message>
<xml_diff>
--- a/CS SEMINAR/CS SEMINAR/NETWORK VIRTUALIZATION AND SECURITY.docx
+++ b/CS SEMINAR/CS SEMINAR/NETWORK VIRTUALIZATION AND SECURITY.docx
@@ -1,6 +1,6 @@
 
 <file path=word/document.xml><?xml version="1.0" encoding="utf-8"?>
-<w:document xmlns:wpc="http://schemas.microsoft.com/office/word/2010/wordprocessingCanvas" xmlns:cx="http://schemas.microsoft.com/office/drawing/2014/chartex" xmlns:cx1="http://schemas.microsoft.com/office/drawing/2015/9/8/chartex" xmlns:cx2="http://schemas.microsoft.com/office/drawing/2015/10/21/chartex" xmlns:cx3="http://schemas.microsoft.com/office/drawing/2016/5/9/chartex" xmlns:cx4="http://schemas.microsoft.com/office/drawing/2016/5/10/chartex" xmlns:cx5="http://schemas.microsoft.com/office/drawing/2016/5/11/chartex" xmlns:cx6="http://schemas.microsoft.com/office/drawing/2016/5/12/chartex" xmlns:cx7="http://schemas.microsoft.com/office/drawing/2016/5/13/chartex" xmlns:cx8="http://schemas.microsoft.com/office/drawing/2016/5/14/chartex" xmlns:mc="http://schemas.openxmlformats.org/markup-compatibility/2006" xmlns:aink="http://schemas.microsoft.com/office/drawing/2016/ink" xmlns:am3d="http://schemas.microsoft.com/office/drawing/2017/model3d" xmlns:o="urn:schemas-microsoft-com:office:office" xmlns:oel="http://schemas.microsoft.com/office/2019/extlst" xmlns:r="http://schemas.openxmlformats.org/officeDocument/2006/relationships" xmlns:m="http://schemas.openxmlformats.org/officeDocument/2006/math" xmlns:v="urn:schemas-microsoft-com:vml" xmlns:wp14="http://schemas.microsoft.com/office/word/2010/wordprocessingDrawing" xmlns:wp="http://schemas.openxmlformats.org/drawingml/2006/wordprocessingDrawing" xmlns:w10="urn:schemas-microsoft-com:office:word" xmlns:w="http://schemas.openxmlformats.org/wordprocessingml/2006/main" xmlns:w14="http://schemas.microsoft.com/office/word/2010/wordml" xmlns:w15="http://schemas.microsoft.com/office/word/2012/wordml" xmlns:w16cex="http://schemas.microsoft.com/office/word/2018/wordml/cex" xmlns:w16cid="http://schemas.microsoft.com/office/word/2016/wordml/cid" xmlns:w16="http://schemas.microsoft.com/office/word/2018/wordml" xmlns:w16du="http://schemas.microsoft.com/office/word/2023/wordml/word16du" xmlns:w16sdtdh="http://schemas.microsoft.com/office/word/2020/wordml/sdtdatahash" xmlns:w16sdtfl="http://schemas.microsoft.com/office/word/2024/wordml/sdtformatlock" xmlns:w16se="http://schemas.microsoft.com/office/word/2015/wordml/symex" xmlns:wpg="http://schemas.microsoft.com/office/word/2010/wordprocessingGroup" xmlns:wpi="http://schemas.microsoft.com/office/word/2010/wordprocessingInk" xmlns:wne="http://schemas.microsoft.com/office/word/2006/wordml" xmlns:wps="http://schemas.microsoft.com/office/word/2010/wordprocessingShape" mc:Ignorable="w14 w15 w16se w16cid w16 w16cex w16sdtdh w16sdtfl w16du wp14">
+<w:document xmlns:wpc="http://schemas.microsoft.com/office/word/2010/wordprocessingCanvas" xmlns:cx="http://schemas.microsoft.com/office/drawing/2014/chartex" xmlns:cx1="http://schemas.microsoft.com/office/drawing/2015/9/8/chartex" xmlns:cx2="http://schemas.microsoft.com/office/drawing/2015/10/21/chartex" xmlns:cx3="http://schemas.microsoft.com/office/drawing/2016/5/9/chartex" xmlns:cx4="http://schemas.microsoft.com/office/drawing/2016/5/10/chartex" xmlns:cx5="http://schemas.microsoft.com/office/drawing/2016/5/11/chartex" xmlns:cx6="http://schemas.microsoft.com/office/drawing/2016/5/12/chartex" xmlns:cx7="http://schemas.microsoft.com/office/drawing/2016/5/13/chartex" xmlns:cx8="http://schemas.microsoft.com/office/drawing/2016/5/14/chartex" xmlns:mc="http://schemas.openxmlformats.org/markup-compatibility/2006" xmlns:aink="http://schemas.microsoft.com/office/drawing/2016/ink" xmlns:am3d="http://schemas.microsoft.com/office/drawing/2017/model3d" xmlns:o="urn:schemas-microsoft-com:office:office" xmlns:oel="http://schemas.microsoft.com/office/2019/extlst" xmlns:r="http://schemas.openxmlformats.org/officeDocument/2006/relationships" xmlns:m="http://schemas.openxmlformats.org/officeDocument/2006/math" xmlns:v="urn:schemas-microsoft-com:vml" xmlns:wp14="http://schemas.microsoft.com/office/word/2010/wordprocessingDrawing" xmlns:wp="http://schemas.openxmlformats.org/drawingml/2006/wordprocessingDrawing" xmlns:w10="urn:schemas-microsoft-com:office:word" xmlns:w="http://schemas.openxmlformats.org/wordprocessingml/2006/main" xmlns:w14="http://schemas.microsoft.com/office/word/2010/wordml" xmlns:w15="http://schemas.microsoft.com/office/word/2012/wordml" xmlns:w16cei="http://schemas.microsoft.com/office/word/2026/wordml/cei" xmlns:w16cex="http://schemas.microsoft.com/office/word/2018/wordml/cex" xmlns:w16cid="http://schemas.microsoft.com/office/word/2016/wordml/cid" xmlns:w16="http://schemas.microsoft.com/office/word/2018/wordml" xmlns:w16du="http://schemas.microsoft.com/office/word/2023/wordml/word16du" xmlns:w16sdtdh="http://schemas.microsoft.com/office/word/2020/wordml/sdtdatahash" xmlns:w16sdtfl="http://schemas.microsoft.com/office/word/2024/wordml/sdtformatlock" xmlns:w16se="http://schemas.microsoft.com/office/word/2015/wordml/symex" xmlns:wpg="http://schemas.microsoft.com/office/word/2010/wordprocessingGroup" xmlns:wpi="http://schemas.microsoft.com/office/word/2010/wordprocessingInk" xmlns:wne="http://schemas.microsoft.com/office/word/2006/wordml" xmlns:wps="http://schemas.microsoft.com/office/word/2010/wordprocessingShape" mc:Ignorable="w14 w15 w16se w16cid w16 w16cex w16sdtdh w16sdtfl w16du wp14">
   <w:body>
     <w:p>
       <w:pPr>
@@ -20,16 +20,6 @@
         </w:rPr>
         <w:t>NETWORK VIRTUALIZATION AND SECURITY</w:t>
       </w:r>
-    </w:p>
-    <w:p>
-      <w:pPr>
-        <w:spacing w:after="0"/>
-        <w:jc w:val="center"/>
-        <w:rPr>
-          <w:rFonts w:ascii="Times New Roman" w:hAnsi="Times New Roman" w:cs="Times New Roman"/>
-          <w:b/>
-        </w:rPr>
-      </w:pPr>
     </w:p>
     <w:p>
       <w:pPr>
@@ -458,7 +448,7 @@
           <w:b/>
           <w:caps/>
         </w:rPr>
-        <w:t>JULY</w:t>
+        <w:t>AUGUST</w:t>
       </w:r>
       <w:r>
         <w:rPr>
@@ -500,12 +490,6 @@
           <w:docGrid w:linePitch="360"/>
         </w:sectPr>
       </w:pPr>
-      <w:r>
-        <w:rPr>
-          <w:rFonts w:ascii="Times New Roman" w:hAnsi="Times New Roman" w:cs="Times New Roman"/>
-        </w:rPr>
-        <w:br w:type="page"/>
-      </w:r>
     </w:p>
     <w:p>
       <w:pPr>
@@ -994,7 +978,7 @@
           <w:b/>
           <w:caps/>
         </w:rPr>
-        <w:t>JULY</w:t>
+        <w:t>AUGUST</w:t>
       </w:r>
       <w:r>
         <w:rPr>
@@ -1067,25 +1051,7 @@
           <w:i/>
           <w:iCs/>
         </w:rPr>
-        <w:t xml:space="preserve">Network virtualization has emerged as one of the most transformative technologies in modern computer networking. It enables the creation of multiple virtual networks on a shared physical infrastructure, allowing organizations to improve resource utilization, scalability, flexibility, and operational efficiency. Technologies such as Software-Defined Networking (SDN), Network Function Virtualization (NFV), cloud computing, and network slicing have significantly accelerated the adoption of network virtualization across enterprises, data </w:t>
-      </w:r>
-      <w:proofErr w:type="spellStart"/>
-      <w:r>
-        <w:rPr>
-          <w:rFonts w:ascii="Times New Roman" w:hAnsi="Times New Roman" w:cs="Times New Roman"/>
-          <w:i/>
-          <w:iCs/>
-        </w:rPr>
-        <w:t>centers</w:t>
-      </w:r>
-      <w:proofErr w:type="spellEnd"/>
-      <w:r>
-        <w:rPr>
-          <w:rFonts w:ascii="Times New Roman" w:hAnsi="Times New Roman" w:cs="Times New Roman"/>
-          <w:i/>
-          <w:iCs/>
-        </w:rPr>
-        <w:t xml:space="preserve">, telecommunications networks, and cloud environments. Despite its numerous advantages, network virtualization introduces unique security challenges, including hypervisor attacks, virtual machine escape, unauthorized access, denial-of-service attacks, data leakage, and vulnerabilities associated with multi-tenancy environments. This seminar article examines the concept of network virtualization, its architectures, benefits, security challenges, threats, and mitigation strategies. It further explores emerging trends such as artificial intelligence-driven security, zero-trust architectures, and secure virtualization frameworks for future networks. Recent scholarly literature demonstrates that while network virtualization enhances network agility and cost efficiency, robust security mechanisms are essential for protecting virtualized infrastructures from evolving cyber threats. </w:t>
+        <w:t xml:space="preserve">Network virtualization has emerged as one of the most transformative technologies in modern computer networking. It enables the creation of multiple virtual networks on a shared physical infrastructure, allowing organizations to improve resource utilization, scalability, flexibility, and operational efficiency. Technologies such as Software-Defined Networking (SDN), Network Function Virtualization (NFV), cloud computing, and network slicing have significantly accelerated the adoption of network virtualization across enterprises, data centers, telecommunications networks, and cloud environments. Despite its numerous advantages, network virtualization introduces unique security challenges, including hypervisor attacks, virtual machine escape, unauthorized access, denial-of-service attacks, data leakage, and vulnerabilities associated with multi-tenancy environments. This seminar article examines the concept of network virtualization, its architectures, benefits, security challenges, threats, and mitigation strategies. It further explores emerging trends such as artificial intelligence-driven security, zero-trust architectures, and secure virtualization frameworks for future networks. Recent scholarly literature demonstrates that while network virtualization enhances network agility and cost efficiency, robust security mechanisms are essential for protecting virtualized infrastructures from evolving cyber threats. </w:t>
       </w:r>
     </w:p>
     <w:p>
@@ -1172,21 +1138,7 @@
         <w:rPr>
           <w:rFonts w:ascii="Times New Roman" w:hAnsi="Times New Roman" w:cs="Times New Roman"/>
         </w:rPr>
-        <w:t xml:space="preserve">The rapid advancement of Information and Communication Technology (ICT) has transformed the way organizations design, manage, and utilize network infrastructures. The increasing adoption of cloud computing, Internet of Things (IoT), artificial intelligence (AI), big data analytics, and mobile communication technologies has generated unprecedented demands for scalable, flexible, and efficient network systems. Traditional networking architectures, which rely heavily on dedicated hardware devices such as routers, switches, firewalls, and load balancers, often struggle to meet these dynamic requirements. According to </w:t>
-      </w:r>
-      <w:proofErr w:type="spellStart"/>
-      <w:r>
-        <w:rPr>
-          <w:rFonts w:ascii="Times New Roman" w:hAnsi="Times New Roman" w:cs="Times New Roman"/>
-        </w:rPr>
-        <w:t>Alnaim</w:t>
-      </w:r>
-      <w:proofErr w:type="spellEnd"/>
-      <w:r>
-        <w:rPr>
-          <w:rFonts w:ascii="Times New Roman" w:hAnsi="Times New Roman" w:cs="Times New Roman"/>
-        </w:rPr>
-        <w:t xml:space="preserve"> (2024), conventional network infrastructures are characterized by limited flexibility, high operational costs, and complex management processes, making them less suitable for modern digital environments.</w:t>
+        <w:t>The rapid advancement of Information and Communication Technology (ICT) has transformed the way organizations design, manage, and utilize network infrastructures. The increasing adoption of cloud computing, Internet of Things (IoT), artificial intelligence (AI), big data analytics, and mobile communication technologies has generated unprecedented demands for scalable, flexible, and efficient network systems. Traditional networking architectures, which rely heavily on dedicated hardware devices such as routers, switches, firewalls, and load balancers, often struggle to meet these dynamic requirements. According to Alnaim (2024), conventional network infrastructures are characterized by limited flexibility, high operational costs, and complex management processes, making them less suitable for modern digital environments.</w:t>
       </w:r>
     </w:p>
     <w:p>
@@ -1215,35 +1167,7 @@
         <w:rPr>
           <w:rFonts w:ascii="Times New Roman" w:hAnsi="Times New Roman" w:cs="Times New Roman"/>
         </w:rPr>
-        <w:t xml:space="preserve">(2025) noted that network virtualization has become a critical component of next-generation communication systems because it allows organizations to dynamically allocate resources, automate network management, and rapidly deploy new services without extensive hardware modifications. The concept of network virtualization is closely associated with the evolution of cloud computing and data </w:t>
-      </w:r>
-      <w:proofErr w:type="spellStart"/>
-      <w:r>
-        <w:rPr>
-          <w:rFonts w:ascii="Times New Roman" w:hAnsi="Times New Roman" w:cs="Times New Roman"/>
-        </w:rPr>
-        <w:t>center</w:t>
-      </w:r>
-      <w:proofErr w:type="spellEnd"/>
-      <w:r>
-        <w:rPr>
-          <w:rFonts w:ascii="Times New Roman" w:hAnsi="Times New Roman" w:cs="Times New Roman"/>
-        </w:rPr>
-        <w:t xml:space="preserve"> technologies. As organizations increasingly migrate applications and services to cloud environments, the need for flexible and software-driven networking solutions has become more evident. Network virtualization allows cloud service providers to create isolated virtual networks for different users while utilizing the same physical infrastructure. According to </w:t>
-      </w:r>
-      <w:proofErr w:type="spellStart"/>
-      <w:r>
-        <w:rPr>
-          <w:rFonts w:ascii="Times New Roman" w:hAnsi="Times New Roman" w:cs="Times New Roman"/>
-        </w:rPr>
-        <w:t>Jmila</w:t>
-      </w:r>
-      <w:proofErr w:type="spellEnd"/>
-      <w:r>
-        <w:rPr>
-          <w:rFonts w:ascii="Times New Roman" w:hAnsi="Times New Roman" w:cs="Times New Roman"/>
-        </w:rPr>
-        <w:t xml:space="preserve"> </w:t>
+        <w:t xml:space="preserve">(2025) noted that network virtualization has become a critical component of next-generation communication systems because it allows organizations to dynamically allocate resources, automate network management, and rapidly deploy new services without extensive hardware modifications. The concept of network virtualization is closely associated with the evolution of cloud computing and data center technologies. As organizations increasingly migrate applications and services to cloud environments, the need for flexible and software-driven networking solutions has become more evident. Network virtualization allows cloud service providers to create isolated virtual networks for different users while utilizing the same physical infrastructure. According to Jmila </w:t>
       </w:r>
       <w:r>
         <w:rPr>
@@ -1508,21 +1432,7 @@
         <w:rPr>
           <w:rFonts w:ascii="Times New Roman" w:hAnsi="Times New Roman" w:cs="Times New Roman"/>
         </w:rPr>
-        <w:t xml:space="preserve">The centralized architecture commonly employed in SDN environments also presents unique security risks. Because SDN controllers manage network operations centrally, attackers who successfully compromise a controller may gain extensive control over the entire network infrastructure. Similarly, multi-tenant cloud environments introduce concerns regarding data isolation, privacy protection, and resource sharing among different users. </w:t>
-      </w:r>
-      <w:proofErr w:type="spellStart"/>
-      <w:r>
-        <w:rPr>
-          <w:rFonts w:ascii="Times New Roman" w:hAnsi="Times New Roman" w:cs="Times New Roman"/>
-        </w:rPr>
-        <w:t>Alnaim</w:t>
-      </w:r>
-      <w:proofErr w:type="spellEnd"/>
-      <w:r>
-        <w:rPr>
-          <w:rFonts w:ascii="Times New Roman" w:hAnsi="Times New Roman" w:cs="Times New Roman"/>
-        </w:rPr>
-        <w:t xml:space="preserve"> (2024) observed that securing virtualized networks has become one of the most critical challenges facing network administrators and cybersecurity professionals due to the growing sophistication of cyber threats targeting software-defined infrastructures.</w:t>
+        <w:t>The centralized architecture commonly employed in SDN environments also presents unique security risks. Because SDN controllers manage network operations centrally, attackers who successfully compromise a controller may gain extensive control over the entire network infrastructure. Similarly, multi-tenant cloud environments introduce concerns regarding data isolation, privacy protection, and resource sharing among different users. Alnaim (2024) observed that securing virtualized networks has become one of the most critical challenges facing network administrators and cybersecurity professionals due to the growing sophistication of cyber threats targeting software-defined infrastructures.</w:t>
       </w:r>
     </w:p>
     <w:p>
@@ -1537,21 +1447,7 @@
         <w:rPr>
           <w:rFonts w:ascii="Times New Roman" w:hAnsi="Times New Roman" w:cs="Times New Roman"/>
         </w:rPr>
-        <w:t xml:space="preserve">In response to these challenges, researchers and industry practitioners have proposed various security solutions to enhance the protection of virtualized networks. Emerging technologies such as artificial intelligence-based intrusion detection systems, machine learning-driven threat analysis, blockchain-enabled trust management systems, confidential computing, and Zero Trust security architectures are increasingly being integrated into virtualized environments. According to </w:t>
-      </w:r>
-      <w:proofErr w:type="spellStart"/>
-      <w:r>
-        <w:rPr>
-          <w:rFonts w:ascii="Times New Roman" w:hAnsi="Times New Roman" w:cs="Times New Roman"/>
-        </w:rPr>
-        <w:t>Spiekermann</w:t>
-      </w:r>
-      <w:proofErr w:type="spellEnd"/>
-      <w:r>
-        <w:rPr>
-          <w:rFonts w:ascii="Times New Roman" w:hAnsi="Times New Roman" w:cs="Times New Roman"/>
-        </w:rPr>
-        <w:t xml:space="preserve"> </w:t>
+        <w:t xml:space="preserve">In response to these challenges, researchers and industry practitioners have proposed various security solutions to enhance the protection of virtualized networks. Emerging technologies such as artificial intelligence-based intrusion detection systems, machine learning-driven threat analysis, blockchain-enabled trust management systems, confidential computing, and Zero Trust security architectures are increasingly being integrated into virtualized environments. According to Spiekermann </w:t>
       </w:r>
       <w:r>
         <w:rPr>
@@ -1565,35 +1461,7 @@
         <w:rPr>
           <w:rFonts w:ascii="Times New Roman" w:hAnsi="Times New Roman" w:cs="Times New Roman"/>
         </w:rPr>
-        <w:t xml:space="preserve">(2024), AI-driven security systems can significantly improve the detection and mitigation of cyber threats in virtualized networks by </w:t>
-      </w:r>
-      <w:proofErr w:type="spellStart"/>
-      <w:r>
-        <w:rPr>
-          <w:rFonts w:ascii="Times New Roman" w:hAnsi="Times New Roman" w:cs="Times New Roman"/>
-        </w:rPr>
-        <w:t>analyzing</w:t>
-      </w:r>
-      <w:proofErr w:type="spellEnd"/>
-      <w:r>
-        <w:rPr>
-          <w:rFonts w:ascii="Times New Roman" w:hAnsi="Times New Roman" w:cs="Times New Roman"/>
-        </w:rPr>
-        <w:t xml:space="preserve"> large volumes of network traffic and identifying anomalous </w:t>
-      </w:r>
-      <w:proofErr w:type="spellStart"/>
-      <w:r>
-        <w:rPr>
-          <w:rFonts w:ascii="Times New Roman" w:hAnsi="Times New Roman" w:cs="Times New Roman"/>
-        </w:rPr>
-        <w:t>behaviors</w:t>
-      </w:r>
-      <w:proofErr w:type="spellEnd"/>
-      <w:r>
-        <w:rPr>
-          <w:rFonts w:ascii="Times New Roman" w:hAnsi="Times New Roman" w:cs="Times New Roman"/>
-        </w:rPr>
-        <w:t xml:space="preserve"> in real time. As digital transformation continues to accelerate globally, network virtualization is expected to play an increasingly important role in supporting future communication infrastructures. Its ability to improve scalability, flexibility, automation, and resource efficiency makes it a foundational technology for modern networking environments. </w:t>
+        <w:t xml:space="preserve">(2024), AI-driven security systems can significantly improve the detection and mitigation of cyber threats in virtualized networks by analyzing large volumes of network traffic and identifying anomalous behaviors in real time. As digital transformation continues to accelerate globally, network virtualization is expected to play an increasingly important role in supporting future communication infrastructures. Its ability to improve scalability, flexibility, automation, and resource efficiency makes it a foundational technology for modern networking environments. </w:t>
       </w:r>
     </w:p>
     <w:p>
@@ -1645,21 +1513,7 @@
         <w:rPr>
           <w:rFonts w:ascii="Times New Roman" w:hAnsi="Times New Roman" w:cs="Times New Roman"/>
         </w:rPr>
-        <w:t>Network virtualization is a modern networking technology that enables the creation of multiple independent virtual networks on a shared physical infrastructure. It involves abstracting network resources and services, including switches, routers, firewalls, load balancers, and communication links, from their underlying physical hardware and presenting them as logical or software-defined entities. This abstraction allows organizations to deploy, manage, and modify network services more efficiently without the need for extensive physical infrastructure upgrades or modifications (</w:t>
-      </w:r>
-      <w:proofErr w:type="spellStart"/>
-      <w:r>
-        <w:rPr>
-          <w:rFonts w:ascii="Times New Roman" w:hAnsi="Times New Roman" w:cs="Times New Roman"/>
-        </w:rPr>
-        <w:t>Alnaim</w:t>
-      </w:r>
-      <w:proofErr w:type="spellEnd"/>
-      <w:r>
-        <w:rPr>
-          <w:rFonts w:ascii="Times New Roman" w:hAnsi="Times New Roman" w:cs="Times New Roman"/>
-        </w:rPr>
-        <w:t>, 2024).</w:t>
+        <w:t>Network virtualization is a modern networking technology that enables the creation of multiple independent virtual networks on a shared physical infrastructure. It involves abstracting network resources and services, including switches, routers, firewalls, load balancers, and communication links, from their underlying physical hardware and presenting them as logical or software-defined entities. This abstraction allows organizations to deploy, manage, and modify network services more efficiently without the need for extensive physical infrastructure upgrades or modifications (Alnaim, 2024).</w:t>
       </w:r>
     </w:p>
     <w:p>
@@ -1739,21 +1593,7 @@
         <w:rPr>
           <w:rFonts w:ascii="Times New Roman" w:hAnsi="Times New Roman" w:cs="Times New Roman"/>
         </w:rPr>
-        <w:t>Figure 1: Network Virtualization (</w:t>
-      </w:r>
-      <w:proofErr w:type="spellStart"/>
-      <w:r>
-        <w:rPr>
-          <w:rFonts w:ascii="Times New Roman" w:hAnsi="Times New Roman" w:cs="Times New Roman"/>
-        </w:rPr>
-        <w:t>Alnaim</w:t>
-      </w:r>
-      <w:proofErr w:type="spellEnd"/>
-      <w:r>
-        <w:rPr>
-          <w:rFonts w:ascii="Times New Roman" w:hAnsi="Times New Roman" w:cs="Times New Roman"/>
-        </w:rPr>
-        <w:t>, 2024).</w:t>
+        <w:t>Figure 1: Network Virtualization (Alnaim, 2024).</w:t>
       </w:r>
     </w:p>
     <w:p>
@@ -1898,21 +1738,7 @@
         <w:rPr>
           <w:rFonts w:ascii="Times New Roman" w:hAnsi="Times New Roman" w:cs="Times New Roman"/>
         </w:rPr>
-        <w:t>Enabling dynamic scaling of network resources based on workload demands and user requirements (</w:t>
-      </w:r>
-      <w:proofErr w:type="spellStart"/>
-      <w:r>
-        <w:rPr>
-          <w:rFonts w:ascii="Times New Roman" w:hAnsi="Times New Roman" w:cs="Times New Roman"/>
-        </w:rPr>
-        <w:t>Jmila</w:t>
-      </w:r>
-      <w:proofErr w:type="spellEnd"/>
-      <w:r>
-        <w:rPr>
-          <w:rFonts w:ascii="Times New Roman" w:hAnsi="Times New Roman" w:cs="Times New Roman"/>
-        </w:rPr>
-        <w:t xml:space="preserve"> </w:t>
+        <w:t xml:space="preserve">Enabling dynamic scaling of network resources based on workload demands and user requirements (Jmila </w:t>
       </w:r>
       <w:r>
         <w:rPr>
@@ -2040,21 +1866,7 @@
         <w:rPr>
           <w:rFonts w:ascii="Times New Roman" w:hAnsi="Times New Roman" w:cs="Times New Roman"/>
         </w:rPr>
-        <w:t xml:space="preserve">(2025), internal virtualization improves network flexibility and simplifies the implementation of security policies across organizational units. Similarly, </w:t>
-      </w:r>
-      <w:proofErr w:type="spellStart"/>
-      <w:r>
-        <w:rPr>
-          <w:rFonts w:ascii="Times New Roman" w:hAnsi="Times New Roman" w:cs="Times New Roman"/>
-        </w:rPr>
-        <w:t>Jmila</w:t>
-      </w:r>
-      <w:proofErr w:type="spellEnd"/>
-      <w:r>
-        <w:rPr>
-          <w:rFonts w:ascii="Times New Roman" w:hAnsi="Times New Roman" w:cs="Times New Roman"/>
-        </w:rPr>
-        <w:t xml:space="preserve"> </w:t>
+        <w:t xml:space="preserve">(2025), internal virtualization improves network flexibility and simplifies the implementation of security policies across organizational units. Similarly, Jmila </w:t>
       </w:r>
       <w:r>
         <w:rPr>
@@ -2300,21 +2112,7 @@
         <w:rPr>
           <w:rFonts w:ascii="Times New Roman" w:hAnsi="Times New Roman" w:cs="Times New Roman"/>
         </w:rPr>
-        <w:t xml:space="preserve">External network virtualization plays a crucial role in modern cloud computing and wide-area networking environments by allowing organizations to interconnect multiple locations and services through a centralized virtual framework. The technology supports remote access, cloud integration, and distributed applications while simplifying network management and reducing operational costs. </w:t>
-      </w:r>
-      <w:proofErr w:type="spellStart"/>
-      <w:r>
-        <w:rPr>
-          <w:rFonts w:ascii="Times New Roman" w:hAnsi="Times New Roman" w:cs="Times New Roman"/>
-        </w:rPr>
-        <w:t>Alnaim</w:t>
-      </w:r>
-      <w:proofErr w:type="spellEnd"/>
-      <w:r>
-        <w:rPr>
-          <w:rFonts w:ascii="Times New Roman" w:hAnsi="Times New Roman" w:cs="Times New Roman"/>
-        </w:rPr>
-        <w:t xml:space="preserve"> (2024) noted that external virtualization is fundamental to 5G and cloud-native architectures because it enables scalable service delivery and efficient resource sharing across geographically distributed infrastructures. Furthermore, Revathi </w:t>
+        <w:t xml:space="preserve">External network virtualization plays a crucial role in modern cloud computing and wide-area networking environments by allowing organizations to interconnect multiple locations and services through a centralized virtual framework. The technology supports remote access, cloud integration, and distributed applications while simplifying network management and reducing operational costs. Alnaim (2024) noted that external virtualization is fundamental to 5G and cloud-native architectures because it enables scalable service delivery and efficient resource sharing across geographically distributed infrastructures. Furthermore, Revathi </w:t>
       </w:r>
       <w:r>
         <w:rPr>
@@ -2616,35 +2414,13 @@
         <w:rPr>
           <w:rFonts w:ascii="Times New Roman" w:hAnsi="Times New Roman" w:cs="Times New Roman"/>
         </w:rPr>
-        <w:t xml:space="preserve">VMware </w:t>
-      </w:r>
-      <w:proofErr w:type="spellStart"/>
-      <w:proofErr w:type="gramStart"/>
-      <w:r>
-        <w:rPr>
-          <w:rFonts w:ascii="Times New Roman" w:hAnsi="Times New Roman" w:cs="Times New Roman"/>
-        </w:rPr>
-        <w:t>ESXi</w:t>
-      </w:r>
-      <w:proofErr w:type="spellEnd"/>
-      <w:r>
-        <w:rPr>
-          <w:rFonts w:ascii="Times New Roman" w:hAnsi="Times New Roman" w:cs="Times New Roman"/>
-        </w:rPr>
-        <w:t xml:space="preserve"> </w:t>
-      </w:r>
-      <w:r>
-        <w:rPr>
-          <w:rFonts w:ascii="Times New Roman" w:hAnsi="Times New Roman" w:cs="Times New Roman"/>
-        </w:rPr>
-        <w:t>,</w:t>
-      </w:r>
-      <w:proofErr w:type="gramEnd"/>
-      <w:r>
-        <w:rPr>
-          <w:rFonts w:ascii="Times New Roman" w:hAnsi="Times New Roman" w:cs="Times New Roman"/>
-        </w:rPr>
-        <w:t xml:space="preserve"> </w:t>
+        <w:t xml:space="preserve">VMware ESXi </w:t>
+      </w:r>
+      <w:r>
+        <w:rPr>
+          <w:rFonts w:ascii="Times New Roman" w:hAnsi="Times New Roman" w:cs="Times New Roman"/>
+        </w:rPr>
+        <w:t xml:space="preserve">, </w:t>
       </w:r>
       <w:r>
         <w:rPr>
@@ -4276,21 +4052,7 @@
         <w:rPr>
           <w:rFonts w:ascii="Times New Roman" w:hAnsi="Times New Roman" w:cs="Times New Roman"/>
         </w:rPr>
-        <w:t xml:space="preserve">Organizations should deploy continuous monitoring solutions and AI-powered threat detection systems capable of identifying unusual network </w:t>
-      </w:r>
-      <w:proofErr w:type="spellStart"/>
-      <w:r>
-        <w:rPr>
-          <w:rFonts w:ascii="Times New Roman" w:hAnsi="Times New Roman" w:cs="Times New Roman"/>
-        </w:rPr>
-        <w:t>behavior</w:t>
-      </w:r>
-      <w:proofErr w:type="spellEnd"/>
-      <w:r>
-        <w:rPr>
-          <w:rFonts w:ascii="Times New Roman" w:hAnsi="Times New Roman" w:cs="Times New Roman"/>
-        </w:rPr>
-        <w:t>, detecting intrusions, and responding to threats in real time.</w:t>
+        <w:t>Organizations should deploy continuous monitoring solutions and AI-powered threat detection systems capable of identifying unusual network behavior, detecting intrusions, and responding to threats in real time.</w:t>
       </w:r>
     </w:p>
     <w:p>
@@ -4400,19 +4162,11 @@
           <w:rFonts w:ascii="Times New Roman" w:hAnsi="Times New Roman" w:cs="Times New Roman"/>
         </w:rPr>
       </w:pPr>
-      <w:proofErr w:type="spellStart"/>
-      <w:r>
-        <w:rPr>
-          <w:rFonts w:ascii="Times New Roman" w:hAnsi="Times New Roman" w:cs="Times New Roman"/>
-        </w:rPr>
-        <w:t>Alnaim</w:t>
-      </w:r>
-      <w:proofErr w:type="spellEnd"/>
-      <w:r>
-        <w:rPr>
-          <w:rFonts w:ascii="Times New Roman" w:hAnsi="Times New Roman" w:cs="Times New Roman"/>
-        </w:rPr>
-        <w:t xml:space="preserve">, A. K. (2024). Securing 5G virtual networks: A critical analysis of SDN, NFV, and network slicing security. </w:t>
+      <w:r>
+        <w:rPr>
+          <w:rFonts w:ascii="Times New Roman" w:hAnsi="Times New Roman" w:cs="Times New Roman"/>
+        </w:rPr>
+        <w:t xml:space="preserve">Alnaim, A. K. (2024). Securing 5G virtual networks: A critical analysis of SDN, NFV, and network slicing security. </w:t>
       </w:r>
       <w:r>
         <w:rPr>
@@ -4472,35 +4226,7 @@
         <w:rPr>
           <w:rFonts w:ascii="Times New Roman" w:hAnsi="Times New Roman" w:cs="Times New Roman"/>
         </w:rPr>
-        <w:t>Domínguez-Dorado, M., Calle-</w:t>
-      </w:r>
-      <w:proofErr w:type="spellStart"/>
-      <w:r>
-        <w:rPr>
-          <w:rFonts w:ascii="Times New Roman" w:hAnsi="Times New Roman" w:cs="Times New Roman"/>
-        </w:rPr>
-        <w:t>Cancho</w:t>
-      </w:r>
-      <w:proofErr w:type="spellEnd"/>
-      <w:r>
-        <w:rPr>
-          <w:rFonts w:ascii="Times New Roman" w:hAnsi="Times New Roman" w:cs="Times New Roman"/>
-        </w:rPr>
-        <w:t>, J., Galeano-</w:t>
-      </w:r>
-      <w:proofErr w:type="spellStart"/>
-      <w:r>
-        <w:rPr>
-          <w:rFonts w:ascii="Times New Roman" w:hAnsi="Times New Roman" w:cs="Times New Roman"/>
-        </w:rPr>
-        <w:t>Brajones</w:t>
-      </w:r>
-      <w:proofErr w:type="spellEnd"/>
-      <w:r>
-        <w:rPr>
-          <w:rFonts w:ascii="Times New Roman" w:hAnsi="Times New Roman" w:cs="Times New Roman"/>
-        </w:rPr>
-        <w:t xml:space="preserve">, J., Rodríguez-Pérez, F. J., &amp; Cortés-Polo, D. (2024). Detection and mitigation of security threats using virtualized network functions in software-defined networks. </w:t>
+        <w:t xml:space="preserve">Domínguez-Dorado, M., Calle-Cancho, J., Galeano-Brajones, J., Rodríguez-Pérez, F. J., &amp; Cortés-Polo, D. (2024). Detection and mitigation of security threats using virtualized network functions in software-defined networks. </w:t>
       </w:r>
       <w:r>
         <w:rPr>
@@ -4526,33 +4252,11 @@
           <w:rFonts w:ascii="Times New Roman" w:hAnsi="Times New Roman" w:cs="Times New Roman"/>
         </w:rPr>
       </w:pPr>
-      <w:proofErr w:type="spellStart"/>
-      <w:r>
-        <w:rPr>
-          <w:rFonts w:ascii="Times New Roman" w:hAnsi="Times New Roman" w:cs="Times New Roman"/>
-        </w:rPr>
-        <w:t>Jmila</w:t>
-      </w:r>
-      <w:proofErr w:type="spellEnd"/>
-      <w:r>
-        <w:rPr>
-          <w:rFonts w:ascii="Times New Roman" w:hAnsi="Times New Roman" w:cs="Times New Roman"/>
-        </w:rPr>
-        <w:t xml:space="preserve">, H., </w:t>
-      </w:r>
-      <w:proofErr w:type="spellStart"/>
-      <w:r>
-        <w:rPr>
-          <w:rFonts w:ascii="Times New Roman" w:hAnsi="Times New Roman" w:cs="Times New Roman"/>
-        </w:rPr>
-        <w:t>Khedher</w:t>
-      </w:r>
-      <w:proofErr w:type="spellEnd"/>
-      <w:r>
-        <w:rPr>
-          <w:rFonts w:ascii="Times New Roman" w:hAnsi="Times New Roman" w:cs="Times New Roman"/>
-        </w:rPr>
-        <w:t xml:space="preserve">, M. I., &amp; El-Yacoubi, M. A. (2024). The promise of applying machine learning techniques to network function virtualization. </w:t>
+      <w:r>
+        <w:rPr>
+          <w:rFonts w:ascii="Times New Roman" w:hAnsi="Times New Roman" w:cs="Times New Roman"/>
+        </w:rPr>
+        <w:t xml:space="preserve">Jmila, H., Khedher, M. I., &amp; El-Yacoubi, M. A. (2024). The promise of applying machine learning techniques to network function virtualization. </w:t>
       </w:r>
       <w:r>
         <w:rPr>
@@ -4606,6 +4310,7 @@
         <w:jc w:val="both"/>
         <w:rPr>
           <w:rFonts w:ascii="Times New Roman" w:hAnsi="Times New Roman" w:cs="Times New Roman"/>
+          <w:lang w:val="it-IT"/>
         </w:rPr>
       </w:pPr>
       <w:r>
@@ -4619,12 +4324,14 @@
           <w:rFonts w:ascii="Times New Roman" w:hAnsi="Times New Roman" w:cs="Times New Roman"/>
           <w:i/>
           <w:iCs/>
+          <w:lang w:val="it-IT"/>
         </w:rPr>
         <w:t>IEEE Access, 12</w:t>
       </w:r>
       <w:r>
         <w:rPr>
           <w:rFonts w:ascii="Times New Roman" w:hAnsi="Times New Roman" w:cs="Times New Roman"/>
+          <w:lang w:val="it-IT"/>
         </w:rPr>
         <w:t>, 48512–48535.</w:t>
       </w:r>
@@ -4641,8 +4348,15 @@
       <w:r>
         <w:rPr>
           <w:rFonts w:ascii="Times New Roman" w:hAnsi="Times New Roman" w:cs="Times New Roman"/>
-        </w:rPr>
-        <w:t xml:space="preserve">Raza, M., Ali, S., Hussain, F., &amp; Ahmad, T. (2024). Performance optimization and security in network virtualization: Current trends and future directions. </w:t>
+          <w:lang w:val="it-IT"/>
+        </w:rPr>
+        <w:t xml:space="preserve">Raza, M., Ali, S., Hussain, F., &amp; Ahmad, T. (2024). </w:t>
+      </w:r>
+      <w:r>
+        <w:rPr>
+          <w:rFonts w:ascii="Times New Roman" w:hAnsi="Times New Roman" w:cs="Times New Roman"/>
+        </w:rPr>
+        <w:t xml:space="preserve">Performance optimization and security in network virtualization: Current trends and future directions. </w:t>
       </w:r>
       <w:r>
         <w:rPr>
@@ -4701,7 +4415,6 @@
       <w:r>
         <w:rPr>
           <w:rFonts w:ascii="Times New Roman" w:hAnsi="Times New Roman" w:cs="Times New Roman"/>
-          <w:lang w:val="de-DE"/>
         </w:rPr>
         <w:t xml:space="preserve">Spiekermann, D., Eggendorfer, T., &amp; Keller, J. (2024). </w:t>
       </w:r>
@@ -4738,7 +4451,6 @@
       <w:r>
         <w:rPr>
           <w:rFonts w:ascii="Times New Roman" w:hAnsi="Times New Roman" w:cs="Times New Roman"/>
-          <w:lang w:val="de-DE"/>
         </w:rPr>
         <w:t xml:space="preserve">Yazidi, M., Alghamdi, A., &amp; Alharbi, F. (2024). </w:t>
       </w:r>
@@ -4775,7 +4487,6 @@
       <w:r>
         <w:rPr>
           <w:rFonts w:ascii="Times New Roman" w:hAnsi="Times New Roman" w:cs="Times New Roman"/>
-          <w:lang w:val="de-DE"/>
         </w:rPr>
         <w:t xml:space="preserve">Zhang, X., Wang, Y., &amp; Liu, H. (2024). </w:t>
       </w:r>
@@ -4821,7 +4532,7 @@
 </file>
 
 <file path=word/endnotes.xml><?xml version="1.0" encoding="utf-8"?>
-<w:endnotes xmlns:wpc="http://schemas.microsoft.com/office/word/2010/wordprocessingCanvas" xmlns:cx="http://schemas.microsoft.com/office/drawing/2014/chartex" xmlns:cx1="http://schemas.microsoft.com/office/drawing/2015/9/8/chartex" xmlns:cx2="http://schemas.microsoft.com/office/drawing/2015/10/21/chartex" xmlns:cx3="http://schemas.microsoft.com/office/drawing/2016/5/9/chartex" xmlns:cx4="http://schemas.microsoft.com/office/drawing/2016/5/10/chartex" xmlns:cx5="http://schemas.microsoft.com/office/drawing/2016/5/11/chartex" xmlns:cx6="http://schemas.microsoft.com/office/drawing/2016/5/12/chartex" xmlns:cx7="http://schemas.microsoft.com/office/drawing/2016/5/13/chartex" xmlns:cx8="http://schemas.microsoft.com/office/drawing/2016/5/14/chartex" xmlns:mc="http://schemas.openxmlformats.org/markup-compatibility/2006" xmlns:aink="http://schemas.microsoft.com/office/drawing/2016/ink" xmlns:am3d="http://schemas.microsoft.com/office/drawing/2017/model3d" xmlns:o="urn:schemas-microsoft-com:office:office" xmlns:oel="http://schemas.microsoft.com/office/2019/extlst" xmlns:r="http://schemas.openxmlformats.org/officeDocument/2006/relationships" xmlns:m="http://schemas.openxmlformats.org/officeDocument/2006/math" xmlns:v="urn:schemas-microsoft-com:vml" xmlns:wp14="http://schemas.microsoft.com/office/word/2010/wordprocessingDrawing" xmlns:wp="http://schemas.openxmlformats.org/drawingml/2006/wordprocessingDrawing" xmlns:w10="urn:schemas-microsoft-com:office:word" xmlns:w="http://schemas.openxmlformats.org/wordprocessingml/2006/main" xmlns:w14="http://schemas.microsoft.com/office/word/2010/wordml" xmlns:w15="http://schemas.microsoft.com/office/word/2012/wordml" xmlns:w16cex="http://schemas.microsoft.com/office/word/2018/wordml/cex" xmlns:w16cid="http://schemas.microsoft.com/office/word/2016/wordml/cid" xmlns:w16="http://schemas.microsoft.com/office/word/2018/wordml" xmlns:w16du="http://schemas.microsoft.com/office/word/2023/wordml/word16du" xmlns:w16sdtdh="http://schemas.microsoft.com/office/word/2020/wordml/sdtdatahash" xmlns:w16sdtfl="http://schemas.microsoft.com/office/word/2024/wordml/sdtformatlock" xmlns:w16se="http://schemas.microsoft.com/office/word/2015/wordml/symex" xmlns:wpg="http://schemas.microsoft.com/office/word/2010/wordprocessingGroup" xmlns:wpi="http://schemas.microsoft.com/office/word/2010/wordprocessingInk" xmlns:wne="http://schemas.microsoft.com/office/word/2006/wordml" xmlns:wps="http://schemas.microsoft.com/office/word/2010/wordprocessingShape" mc:Ignorable="w14 w15 w16se w16cid w16 w16cex w16sdtdh w16sdtfl w16du wp14">
+<w:endnotes xmlns:wpc="http://schemas.microsoft.com/office/word/2010/wordprocessingCanvas" xmlns:cx="http://schemas.microsoft.com/office/drawing/2014/chartex" xmlns:cx1="http://schemas.microsoft.com/office/drawing/2015/9/8/chartex" xmlns:cx2="http://schemas.microsoft.com/office/drawing/2015/10/21/chartex" xmlns:cx3="http://schemas.microsoft.com/office/drawing/2016/5/9/chartex" xmlns:cx4="http://schemas.microsoft.com/office/drawing/2016/5/10/chartex" xmlns:cx5="http://schemas.microsoft.com/office/drawing/2016/5/11/chartex" xmlns:cx6="http://schemas.microsoft.com/office/drawing/2016/5/12/chartex" xmlns:cx7="http://schemas.microsoft.com/office/drawing/2016/5/13/chartex" xmlns:cx8="http://schemas.microsoft.com/office/drawing/2016/5/14/chartex" xmlns:mc="http://schemas.openxmlformats.org/markup-compatibility/2006" xmlns:aink="http://schemas.microsoft.com/office/drawing/2016/ink" xmlns:am3d="http://schemas.microsoft.com/office/drawing/2017/model3d" xmlns:o="urn:schemas-microsoft-com:office:office" xmlns:oel="http://schemas.microsoft.com/office/2019/extlst" xmlns:r="http://schemas.openxmlformats.org/officeDocument/2006/relationships" xmlns:m="http://schemas.openxmlformats.org/officeDocument/2006/math" xmlns:v="urn:schemas-microsoft-com:vml" xmlns:wp14="http://schemas.microsoft.com/office/word/2010/wordprocessingDrawing" xmlns:wp="http://schemas.openxmlformats.org/drawingml/2006/wordprocessingDrawing" xmlns:w10="urn:schemas-microsoft-com:office:word" xmlns:w="http://schemas.openxmlformats.org/wordprocessingml/2006/main" xmlns:w14="http://schemas.microsoft.com/office/word/2010/wordml" xmlns:w15="http://schemas.microsoft.com/office/word/2012/wordml" xmlns:w16cei="http://schemas.microsoft.com/office/word/2026/wordml/cei" xmlns:w16cex="http://schemas.microsoft.com/office/word/2018/wordml/cex" xmlns:w16cid="http://schemas.microsoft.com/office/word/2016/wordml/cid" xmlns:w16="http://schemas.microsoft.com/office/word/2018/wordml" xmlns:w16du="http://schemas.microsoft.com/office/word/2023/wordml/word16du" xmlns:w16sdtdh="http://schemas.microsoft.com/office/word/2020/wordml/sdtdatahash" xmlns:w16sdtfl="http://schemas.microsoft.com/office/word/2024/wordml/sdtformatlock" xmlns:w16se="http://schemas.microsoft.com/office/word/2015/wordml/symex" xmlns:wpg="http://schemas.microsoft.com/office/word/2010/wordprocessingGroup" xmlns:wpi="http://schemas.microsoft.com/office/word/2010/wordprocessingInk" xmlns:wne="http://schemas.microsoft.com/office/word/2006/wordml" xmlns:wps="http://schemas.microsoft.com/office/word/2010/wordprocessingShape" mc:Ignorable="w14 w15 w16se w16cid w16 w16cex w16sdtdh w16sdtfl w16du wp14">
   <w:endnote w:type="separator" w:id="-1">
     <w:p>
       <w:pPr>
@@ -4846,7 +4557,7 @@
 </file>
 
 <file path=word/footer1.xml><?xml version="1.0" encoding="utf-8"?>
-<w:ftr xmlns:wpc="http://schemas.microsoft.com/office/word/2010/wordprocessingCanvas" xmlns:cx="http://schemas.microsoft.com/office/drawing/2014/chartex" xmlns:cx1="http://schemas.microsoft.com/office/drawing/2015/9/8/chartex" xmlns:cx2="http://schemas.microsoft.com/office/drawing/2015/10/21/chartex" xmlns:cx3="http://schemas.microsoft.com/office/drawing/2016/5/9/chartex" xmlns:cx4="http://schemas.microsoft.com/office/drawing/2016/5/10/chartex" xmlns:cx5="http://schemas.microsoft.com/office/drawing/2016/5/11/chartex" xmlns:cx6="http://schemas.microsoft.com/office/drawing/2016/5/12/chartex" xmlns:cx7="http://schemas.microsoft.com/office/drawing/2016/5/13/chartex" xmlns:cx8="http://schemas.microsoft.com/office/drawing/2016/5/14/chartex" xmlns:mc="http://schemas.openxmlformats.org/markup-compatibility/2006" xmlns:aink="http://schemas.microsoft.com/office/drawing/2016/ink" xmlns:am3d="http://schemas.microsoft.com/office/drawing/2017/model3d" xmlns:o="urn:schemas-microsoft-com:office:office" xmlns:oel="http://schemas.microsoft.com/office/2019/extlst" xmlns:r="http://schemas.openxmlformats.org/officeDocument/2006/relationships" xmlns:m="http://schemas.openxmlformats.org/officeDocument/2006/math" xmlns:v="urn:schemas-microsoft-com:vml" xmlns:wp14="http://schemas.microsoft.com/office/word/2010/wordprocessingDrawing" xmlns:wp="http://schemas.openxmlformats.org/drawingml/2006/wordprocessingDrawing" xmlns:w10="urn:schemas-microsoft-com:office:word" xmlns:w="http://schemas.openxmlformats.org/wordprocessingml/2006/main" xmlns:w14="http://schemas.microsoft.com/office/word/2010/wordml" xmlns:w15="http://schemas.microsoft.com/office/word/2012/wordml" xmlns:w16cex="http://schemas.microsoft.com/office/word/2018/wordml/cex" xmlns:w16cid="http://schemas.microsoft.com/office/word/2016/wordml/cid" xmlns:w16="http://schemas.microsoft.com/office/word/2018/wordml" xmlns:w16du="http://schemas.microsoft.com/office/word/2023/wordml/word16du" xmlns:w16sdtdh="http://schemas.microsoft.com/office/word/2020/wordml/sdtdatahash" xmlns:w16sdtfl="http://schemas.microsoft.com/office/word/2024/wordml/sdtformatlock" xmlns:w16se="http://schemas.microsoft.com/office/word/2015/wordml/symex" xmlns:wpg="http://schemas.microsoft.com/office/word/2010/wordprocessingGroup" xmlns:wpi="http://schemas.microsoft.com/office/word/2010/wordprocessingInk" xmlns:wne="http://schemas.microsoft.com/office/word/2006/wordml" xmlns:wps="http://schemas.microsoft.com/office/word/2010/wordprocessingShape" mc:Ignorable="w14 w15 w16se w16cid w16 w16cex w16sdtdh w16sdtfl w16du wp14">
+<w:ftr xmlns:wpc="http://schemas.microsoft.com/office/word/2010/wordprocessingCanvas" xmlns:cx="http://schemas.microsoft.com/office/drawing/2014/chartex" xmlns:cx1="http://schemas.microsoft.com/office/drawing/2015/9/8/chartex" xmlns:cx2="http://schemas.microsoft.com/office/drawing/2015/10/21/chartex" xmlns:cx3="http://schemas.microsoft.com/office/drawing/2016/5/9/chartex" xmlns:cx4="http://schemas.microsoft.com/office/drawing/2016/5/10/chartex" xmlns:cx5="http://schemas.microsoft.com/office/drawing/2016/5/11/chartex" xmlns:cx6="http://schemas.microsoft.com/office/drawing/2016/5/12/chartex" xmlns:cx7="http://schemas.microsoft.com/office/drawing/2016/5/13/chartex" xmlns:cx8="http://schemas.microsoft.com/office/drawing/2016/5/14/chartex" xmlns:mc="http://schemas.openxmlformats.org/markup-compatibility/2006" xmlns:aink="http://schemas.microsoft.com/office/drawing/2016/ink" xmlns:am3d="http://schemas.microsoft.com/office/drawing/2017/model3d" xmlns:o="urn:schemas-microsoft-com:office:office" xmlns:oel="http://schemas.microsoft.com/office/2019/extlst" xmlns:r="http://schemas.openxmlformats.org/officeDocument/2006/relationships" xmlns:m="http://schemas.openxmlformats.org/officeDocument/2006/math" xmlns:v="urn:schemas-microsoft-com:vml" xmlns:wp14="http://schemas.microsoft.com/office/word/2010/wordprocessingDrawing" xmlns:wp="http://schemas.openxmlformats.org/drawingml/2006/wordprocessingDrawing" xmlns:w10="urn:schemas-microsoft-com:office:word" xmlns:w="http://schemas.openxmlformats.org/wordprocessingml/2006/main" xmlns:w14="http://schemas.microsoft.com/office/word/2010/wordml" xmlns:w15="http://schemas.microsoft.com/office/word/2012/wordml" xmlns:w16cei="http://schemas.microsoft.com/office/word/2026/wordml/cei" xmlns:w16cex="http://schemas.microsoft.com/office/word/2018/wordml/cex" xmlns:w16cid="http://schemas.microsoft.com/office/word/2016/wordml/cid" xmlns:w16="http://schemas.microsoft.com/office/word/2018/wordml" xmlns:w16du="http://schemas.microsoft.com/office/word/2023/wordml/word16du" xmlns:w16sdtdh="http://schemas.microsoft.com/office/word/2020/wordml/sdtdatahash" xmlns:w16sdtfl="http://schemas.microsoft.com/office/word/2024/wordml/sdtformatlock" xmlns:w16se="http://schemas.microsoft.com/office/word/2015/wordml/symex" xmlns:wpg="http://schemas.microsoft.com/office/word/2010/wordprocessingGroup" xmlns:wpi="http://schemas.microsoft.com/office/word/2010/wordprocessingInk" xmlns:wne="http://schemas.microsoft.com/office/word/2006/wordml" xmlns:wps="http://schemas.microsoft.com/office/word/2010/wordprocessingShape" mc:Ignorable="w14 w15 w16se w16cid w16 w16cex w16sdtdh w16sdtfl w16du wp14">
   <w:sdt>
     <w:sdtPr>
       <w:id w:val="1491833968"/>
@@ -4899,7 +4610,7 @@
 </file>
 
 <file path=word/footnotes.xml><?xml version="1.0" encoding="utf-8"?>
-<w:footnotes xmlns:wpc="http://schemas.microsoft.com/office/word/2010/wordprocessingCanvas" xmlns:cx="http://schemas.microsoft.com/office/drawing/2014/chartex" xmlns:cx1="http://schemas.microsoft.com/office/drawing/2015/9/8/chartex" xmlns:cx2="http://schemas.microsoft.com/office/drawing/2015/10/21/chartex" xmlns:cx3="http://schemas.microsoft.com/office/drawing/2016/5/9/chartex" xmlns:cx4="http://schemas.microsoft.com/office/drawing/2016/5/10/chartex" xmlns:cx5="http://schemas.microsoft.com/office/drawing/2016/5/11/chartex" xmlns:cx6="http://schemas.microsoft.com/office/drawing/2016/5/12/chartex" xmlns:cx7="http://schemas.microsoft.com/office/drawing/2016/5/13/chartex" xmlns:cx8="http://schemas.microsoft.com/office/drawing/2016/5/14/chartex" xmlns:mc="http://schemas.openxmlformats.org/markup-compatibility/2006" xmlns:aink="http://schemas.microsoft.com/office/drawing/2016/ink" xmlns:am3d="http://schemas.microsoft.com/office/drawing/2017/model3d" xmlns:o="urn:schemas-microsoft-com:office:office" xmlns:oel="http://schemas.microsoft.com/office/2019/extlst" xmlns:r="http://schemas.openxmlformats.org/officeDocument/2006/relationships" xmlns:m="http://schemas.openxmlformats.org/officeDocument/2006/math" xmlns:v="urn:schemas-microsoft-com:vml" xmlns:wp14="http://schemas.microsoft.com/office/word/2010/wordprocessingDrawing" xmlns:wp="http://schemas.openxmlformats.org/drawingml/2006/wordprocessingDrawing" xmlns:w10="urn:schemas-microsoft-com:office:word" xmlns:w="http://schemas.openxmlformats.org/wordprocessingml/2006/main" xmlns:w14="http://schemas.microsoft.com/office/word/2010/wordml" xmlns:w15="http://schemas.microsoft.com/office/word/2012/wordml" xmlns:w16cex="http://schemas.microsoft.com/office/word/2018/wordml/cex" xmlns:w16cid="http://schemas.microsoft.com/office/word/2016/wordml/cid" xmlns:w16="http://schemas.microsoft.com/office/word/2018/wordml" xmlns:w16du="http://schemas.microsoft.com/office/word/2023/wordml/word16du" xmlns:w16sdtdh="http://schemas.microsoft.com/office/word/2020/wordml/sdtdatahash" xmlns:w16sdtfl="http://schemas.microsoft.com/office/word/2024/wordml/sdtformatlock" xmlns:w16se="http://schemas.microsoft.com/office/word/2015/wordml/symex" xmlns:wpg="http://schemas.microsoft.com/office/word/2010/wordprocessingGroup" xmlns:wpi="http://schemas.microsoft.com/office/word/2010/wordprocessingInk" xmlns:wne="http://schemas.microsoft.com/office/word/2006/wordml" xmlns:wps="http://schemas.microsoft.com/office/word/2010/wordprocessingShape" mc:Ignorable="w14 w15 w16se w16cid w16 w16cex w16sdtdh w16sdtfl w16du wp14">
+<w:footnotes xmlns:wpc="http://schemas.microsoft.com/office/word/2010/wordprocessingCanvas" xmlns:cx="http://schemas.microsoft.com/office/drawing/2014/chartex" xmlns:cx1="http://schemas.microsoft.com/office/drawing/2015/9/8/chartex" xmlns:cx2="http://schemas.microsoft.com/office/drawing/2015/10/21/chartex" xmlns:cx3="http://schemas.microsoft.com/office/drawing/2016/5/9/chartex" xmlns:cx4="http://schemas.microsoft.com/office/drawing/2016/5/10/chartex" xmlns:cx5="http://schemas.microsoft.com/office/drawing/2016/5/11/chartex" xmlns:cx6="http://schemas.microsoft.com/office/drawing/2016/5/12/chartex" xmlns:cx7="http://schemas.microsoft.com/office/drawing/2016/5/13/chartex" xmlns:cx8="http://schemas.microsoft.com/office/drawing/2016/5/14/chartex" xmlns:mc="http://schemas.openxmlformats.org/markup-compatibility/2006" xmlns:aink="http://schemas.microsoft.com/office/drawing/2016/ink" xmlns:am3d="http://schemas.microsoft.com/office/drawing/2017/model3d" xmlns:o="urn:schemas-microsoft-com:office:office" xmlns:oel="http://schemas.microsoft.com/office/2019/extlst" xmlns:r="http://schemas.openxmlformats.org/officeDocument/2006/relationships" xmlns:m="http://schemas.openxmlformats.org/officeDocument/2006/math" xmlns:v="urn:schemas-microsoft-com:vml" xmlns:wp14="http://schemas.microsoft.com/office/word/2010/wordprocessingDrawing" xmlns:wp="http://schemas.openxmlformats.org/drawingml/2006/wordprocessingDrawing" xmlns:w10="urn:schemas-microsoft-com:office:word" xmlns:w="http://schemas.openxmlformats.org/wordprocessingml/2006/main" xmlns:w14="http://schemas.microsoft.com/office/word/2010/wordml" xmlns:w15="http://schemas.microsoft.com/office/word/2012/wordml" xmlns:w16cei="http://schemas.microsoft.com/office/word/2026/wordml/cei" xmlns:w16cex="http://schemas.microsoft.com/office/word/2018/wordml/cex" xmlns:w16cid="http://schemas.microsoft.com/office/word/2016/wordml/cid" xmlns:w16="http://schemas.microsoft.com/office/word/2018/wordml" xmlns:w16du="http://schemas.microsoft.com/office/word/2023/wordml/word16du" xmlns:w16sdtdh="http://schemas.microsoft.com/office/word/2020/wordml/sdtdatahash" xmlns:w16sdtfl="http://schemas.microsoft.com/office/word/2024/wordml/sdtformatlock" xmlns:w16se="http://schemas.microsoft.com/office/word/2015/wordml/symex" xmlns:wpg="http://schemas.microsoft.com/office/word/2010/wordprocessingGroup" xmlns:wpi="http://schemas.microsoft.com/office/word/2010/wordprocessingInk" xmlns:wne="http://schemas.microsoft.com/office/word/2006/wordml" xmlns:wps="http://schemas.microsoft.com/office/word/2010/wordprocessingShape" mc:Ignorable="w14 w15 w16se w16cid w16 w16cex w16sdtdh w16sdtfl w16du wp14">
   <w:footnote w:type="separator" w:id="-1">
     <w:p>
       <w:pPr>
@@ -4924,7 +4635,7 @@
 </file>
 
 <file path=word/numbering.xml><?xml version="1.0" encoding="utf-8"?>
-<w:numbering xmlns:wpc="http://schemas.microsoft.com/office/word/2010/wordprocessingCanvas" xmlns:cx="http://schemas.microsoft.com/office/drawing/2014/chartex" xmlns:cx1="http://schemas.microsoft.com/office/drawing/2015/9/8/chartex" xmlns:cx2="http://schemas.microsoft.com/office/drawing/2015/10/21/chartex" xmlns:cx3="http://schemas.microsoft.com/office/drawing/2016/5/9/chartex" xmlns:cx4="http://schemas.microsoft.com/office/drawing/2016/5/10/chartex" xmlns:cx5="http://schemas.microsoft.com/office/drawing/2016/5/11/chartex" xmlns:cx6="http://schemas.microsoft.com/office/drawing/2016/5/12/chartex" xmlns:cx7="http://schemas.microsoft.com/office/drawing/2016/5/13/chartex" xmlns:cx8="http://schemas.microsoft.com/office/drawing/2016/5/14/chartex" xmlns:mc="http://schemas.openxmlformats.org/markup-compatibility/2006" xmlns:aink="http://schemas.microsoft.com/office/drawing/2016/ink" xmlns:am3d="http://schemas.microsoft.com/office/drawing/2017/model3d" xmlns:o="urn:schemas-microsoft-com:office:office" xmlns:oel="http://schemas.microsoft.com/office/2019/extlst" xmlns:r="http://schemas.openxmlformats.org/officeDocument/2006/relationships" xmlns:m="http://schemas.openxmlformats.org/officeDocument/2006/math" xmlns:v="urn:schemas-microsoft-com:vml" xmlns:wp14="http://schemas.microsoft.com/office/word/2010/wordprocessingDrawing" xmlns:wp="http://schemas.openxmlformats.org/drawingml/2006/wordprocessingDrawing" xmlns:w10="urn:schemas-microsoft-com:office:word" xmlns:w="http://schemas.openxmlformats.org/wordprocessingml/2006/main" xmlns:w14="http://schemas.microsoft.com/office/word/2010/wordml" xmlns:w15="http://schemas.microsoft.com/office/word/2012/wordml" xmlns:w16cex="http://schemas.microsoft.com/office/word/2018/wordml/cex" xmlns:w16cid="http://schemas.microsoft.com/office/word/2016/wordml/cid" xmlns:w16="http://schemas.microsoft.com/office/word/2018/wordml" xmlns:w16du="http://schemas.microsoft.com/office/word/2023/wordml/word16du" xmlns:w16sdtdh="http://schemas.microsoft.com/office/word/2020/wordml/sdtdatahash" xmlns:w16sdtfl="http://schemas.microsoft.com/office/word/2024/wordml/sdtformatlock" xmlns:w16se="http://schemas.microsoft.com/office/word/2015/wordml/symex" xmlns:wpg="http://schemas.microsoft.com/office/word/2010/wordprocessingGroup" xmlns:wpi="http://schemas.microsoft.com/office/word/2010/wordprocessingInk" xmlns:wne="http://schemas.microsoft.com/office/word/2006/wordml" xmlns:wps="http://schemas.microsoft.com/office/word/2010/wordprocessingShape" mc:Ignorable="w14 w15 w16se w16cid w16 w16cex w16sdtdh w16sdtfl w16du wp14">
+<w:numbering xmlns:wpc="http://schemas.microsoft.com/office/word/2010/wordprocessingCanvas" xmlns:cx="http://schemas.microsoft.com/office/drawing/2014/chartex" xmlns:cx1="http://schemas.microsoft.com/office/drawing/2015/9/8/chartex" xmlns:cx2="http://schemas.microsoft.com/office/drawing/2015/10/21/chartex" xmlns:cx3="http://schemas.microsoft.com/office/drawing/2016/5/9/chartex" xmlns:cx4="http://schemas.microsoft.com/office/drawing/2016/5/10/chartex" xmlns:cx5="http://schemas.microsoft.com/office/drawing/2016/5/11/chartex" xmlns:cx6="http://schemas.microsoft.com/office/drawing/2016/5/12/chartex" xmlns:cx7="http://schemas.microsoft.com/office/drawing/2016/5/13/chartex" xmlns:cx8="http://schemas.microsoft.com/office/drawing/2016/5/14/chartex" xmlns:mc="http://schemas.openxmlformats.org/markup-compatibility/2006" xmlns:aink="http://schemas.microsoft.com/office/drawing/2016/ink" xmlns:am3d="http://schemas.microsoft.com/office/drawing/2017/model3d" xmlns:o="urn:schemas-microsoft-com:office:office" xmlns:oel="http://schemas.microsoft.com/office/2019/extlst" xmlns:r="http://schemas.openxmlformats.org/officeDocument/2006/relationships" xmlns:m="http://schemas.openxmlformats.org/officeDocument/2006/math" xmlns:v="urn:schemas-microsoft-com:vml" xmlns:wp14="http://schemas.microsoft.com/office/word/2010/wordprocessingDrawing" xmlns:wp="http://schemas.openxmlformats.org/drawingml/2006/wordprocessingDrawing" xmlns:w10="urn:schemas-microsoft-com:office:word" xmlns:w="http://schemas.openxmlformats.org/wordprocessingml/2006/main" xmlns:w14="http://schemas.microsoft.com/office/word/2010/wordml" xmlns:w15="http://schemas.microsoft.com/office/word/2012/wordml" xmlns:w16cei="http://schemas.microsoft.com/office/word/2026/wordml/cei" xmlns:w16cex="http://schemas.microsoft.com/office/word/2018/wordml/cex" xmlns:w16cid="http://schemas.microsoft.com/office/word/2016/wordml/cid" xmlns:w16="http://schemas.microsoft.com/office/word/2018/wordml" xmlns:w16du="http://schemas.microsoft.com/office/word/2023/wordml/word16du" xmlns:w16sdtdh="http://schemas.microsoft.com/office/word/2020/wordml/sdtdatahash" xmlns:w16sdtfl="http://schemas.microsoft.com/office/word/2024/wordml/sdtformatlock" xmlns:w16se="http://schemas.microsoft.com/office/word/2015/wordml/symex" xmlns:wpg="http://schemas.microsoft.com/office/word/2010/wordprocessingGroup" xmlns:wpi="http://schemas.microsoft.com/office/word/2010/wordprocessingInk" xmlns:wne="http://schemas.microsoft.com/office/word/2006/wordml" xmlns:wps="http://schemas.microsoft.com/office/word/2010/wordprocessingShape" mc:Ignorable="w14 w15 w16se w16cid w16 w16cex w16sdtdh w16sdtfl w16du wp14">
   <w:abstractNum w:abstractNumId="0" w15:restartNumberingAfterBreak="0">
     <w:nsid w:val="010A10B8"/>
     <w:multiLevelType w:val="multilevel"/>
@@ -10571,6 +10282,7 @@
   <w:style w:type="character" w:default="1" w:styleId="DefaultParagraphFont">
     <w:name w:val="Default Paragraph Font"/>
     <w:uiPriority w:val="1"/>
+    <w:semiHidden/>
     <w:unhideWhenUsed/>
   </w:style>
   <w:style w:type="table" w:default="1" w:styleId="TableNormal">

</xml_diff>